<commit_message>
refactor(session): nothing in the URL (no ?redirect=)
Protected pages go to their Metadata "Redirect With Session" path as
authored, or to the home page (/) when the row is missing or empty.
Removed REDIRECT_PARAM and getReturnPath(); the login drops Return To
Previous Page and always goes to its own Redirect With Session (guest: its
link; no row: step mode); the example login link is used as authored.
login.docx, READMEs and guide 08 updated.

Co-Authored-By: Claude Opus 5.5 (1M context) <noreply@anthropic.com>
</commit_message>
<xml_diff>
--- a/content-drive/login.docx
+++ b/content-drive/login.docx
@@ -202,28 +202,6 @@
           <w:p>
             <w:r>
               <w:t xml:space="preserve">/perfil</w:t>
-            </w:r>
-          </w:p>
-        </w:tc>
-      </w:tr>
-      <w:tr>
-        <w:tc>
-          <w:tcPr>
-            <w:tcW w:w="2160" w:type="dxa"/>
-          </w:tcPr>
-          <w:p>
-            <w:r>
-              <w:t xml:space="preserve">Return To Previous Page</w:t>
-            </w:r>
-          </w:p>
-        </w:tc>
-        <w:tc>
-          <w:tcPr>
-            <w:tcW w:w="7200" w:type="dxa"/>
-          </w:tcPr>
-          <w:p>
-            <w:r>
-              <w:t xml:space="preserve">yes</w:t>
             </w:r>
           </w:p>
         </w:tc>

</xml_diff>